<commit_message>
Remove third-party section; note costs as client-side usage-based
Removed Section 6.3 (Third-Party Integration Setup table and heading).
Updated NOT INCLUDED note to clearly state all third-party API costs
(Maps, Firebase, SMS, email, S3, Sentry, PayHere/Stripe fees) are
usage-based and billed directly to the client. Redistributed the
Rs. 50,000 into contingency to keep total at Rs. 11,00,000.
Renumbered sections 6.4→6.3, 6.5→6.4, 6.6→6.5.

https://claude.ai/code/session_01WQuCBGtMUv6t4K2ScLL4px
</commit_message>
<xml_diff>
--- a/YAARL360_Phase1_Proposal_11L_v2.docx
+++ b/YAARL360_Phase1_Proposal_11L_v2.docx
@@ -10564,7 +10564,7 @@
                 <w:sz w:val="21"/>
                 <w:szCs w:val="21"/>
               </w:rPr>
-              <w:t xml:space="preserve">NOT INCLUDED IN THIS BUDGET — Client-provided items: Deployment server hardware and hosting costs, Apple Developer Account ($99/year), Google Play Developer Account ($25 one-time), PayHere merchant account (free to register), Google Maps API usage costs (billed to client Google Cloud account), Firebase usage costs, AWS S3 / Cloudflare R2 storage costs, SMS OTP usage charges (Dialog/Mobitel), SendGrid email usage costs. These are ongoing operational costs billed directly to the client by each service provider.</w:t>
+              <w:t>NOT INCLUDED IN THIS BUDGET — Third-party service costs (Google Maps API, Firebase, AWS S3/Cloudflare R2, SendGrid email, SMS OTP via Dialog/Mobitel, PayHere transaction fees, Stripe processing fees, Sentry monitoring) are usage-based and billed directly to the client by each service provider. These are operational costs that vary with platform usage — not development costs. Additionally: Deployment server hardware, Apple Developer Account ($99/year), Google Play Developer Account ($25 one-time), PayHere merchant account, domain name, and SSL certificate are client-provided and not included.</w:t>
             </w:r>
           </w:p>
         </w:tc>
@@ -11659,7 +11659,6 @@
                 <w:sz w:val="21"/>
                 <w:szCs w:val="21"/>
               </w:rPr>
-              <w:t xml:space="preserve"/>
             </w:r>
           </w:p>
         </w:tc>
@@ -12059,6 +12058,14 @@
     </w:p>
     <w:p>
       <w:pPr>
+        <w:spacing w:after="0" w:before="100"/>
+      </w:pPr>
+      <w:r>
+        <w:t xml:space="preserve"/>
+      </w:r>
+    </w:p>
+    <w:p>
+      <w:pPr>
         <w:pStyle w:val="Heading2"/>
         <w:spacing w:after="100" w:before="260"/>
       </w:pPr>
@@ -12071,7 +12078,7 @@
           <w:sz w:val="26"/>
           <w:szCs w:val="26"/>
         </w:rPr>
-        <w:t xml:space="preserve">6.3  Third-Party Integration Setup</w:t>
+        <w:t>6.3  Quality Assurance</w:t>
       </w:r>
     </w:p>
     <w:tbl>
@@ -12087,9 +12094,8 @@
         </w:tblBorders>
       </w:tblPr>
       <w:tblGrid>
-        <w:gridCol w:w="4080"/>
-        <w:gridCol w:w="2640"/>
-        <w:gridCol w:w="2640"/>
+        <w:gridCol w:w="6000"/>
+        <w:gridCol w:w="3360"/>
       </w:tblGrid>
       <w:tr>
         <w:trPr>
@@ -12097,7 +12103,7 @@
         </w:trPr>
         <w:tc>
           <w:tcPr>
-            <w:tcW w:type="dxa" w:w="4080"/>
+            <w:tcW w:type="dxa" w:w="6000"/>
             <w:tcBorders>
               <w:top w:val="single" w:color="CCCCCC" w:sz="1"/>
               <w:left w:val="single" w:color="CCCCCC" w:sz="1"/>
@@ -12122,13 +12128,13 @@
                 <w:sz w:val="20"/>
                 <w:szCs w:val="20"/>
               </w:rPr>
-              <w:t xml:space="preserve">Service</w:t>
-            </w:r>
-          </w:p>
-        </w:tc>
-        <w:tc>
-          <w:tcPr>
-            <w:tcW w:type="dxa" w:w="2640"/>
+              <w:t xml:space="preserve">Item</w:t>
+            </w:r>
+          </w:p>
+        </w:tc>
+        <w:tc>
+          <w:tcPr>
+            <w:tcW w:type="dxa" w:w="3360"/>
             <w:tcBorders>
               <w:top w:val="single" w:color="CCCCCC" w:sz="1"/>
               <w:left w:val="single" w:color="CCCCCC" w:sz="1"/>
@@ -12153,135 +12159,75 @@
                 <w:sz w:val="20"/>
                 <w:szCs w:val="20"/>
               </w:rPr>
-              <w:t xml:space="preserve">Provider</w:t>
-            </w:r>
-          </w:p>
-        </w:tc>
-        <w:tc>
-          <w:tcPr>
-            <w:tcW w:type="dxa" w:w="2640"/>
-            <w:tcBorders>
-              <w:top w:val="single" w:color="CCCCCC" w:sz="1"/>
-              <w:left w:val="single" w:color="CCCCCC" w:sz="1"/>
-              <w:bottom w:val="single" w:color="CCCCCC" w:sz="1"/>
-              <w:right w:val="single" w:color="CCCCCC" w:sz="1"/>
-            </w:tcBorders>
-            <w:shd w:fill="1A3C5E" w:val="clear"/>
-            <w:tcMar>
-              <w:top w:type="dxa" w:w="80"/>
-              <w:left w:type="dxa" w:w="120"/>
-              <w:bottom w:type="dxa" w:w="80"/>
-              <w:right w:type="dxa" w:w="120"/>
-            </w:tcMar>
-          </w:tcPr>
-          <w:p>
-            <w:r>
-              <w:rPr>
-                <w:rFonts w:ascii="Arial" w:cs="Arial" w:eastAsia="Arial" w:hAnsi="Arial"/>
-                <w:b/>
-                <w:bCs/>
-                <w:color w:val="FFFFFF"/>
-                <w:sz w:val="20"/>
-                <w:szCs w:val="20"/>
-              </w:rPr>
-              <w:t xml:space="preserve">Setup Cost (LKR)</w:t>
-            </w:r>
-          </w:p>
-        </w:tc>
-      </w:tr>
-      <w:tr>
-        <w:tc>
-          <w:tcPr>
-            <w:tcW w:type="dxa" w:w="4080"/>
-            <w:tcBorders>
-              <w:top w:val="single" w:color="CCCCCC" w:sz="1"/>
-              <w:left w:val="single" w:color="CCCCCC" w:sz="1"/>
-              <w:bottom w:val="single" w:color="CCCCCC" w:sz="1"/>
-              <w:right w:val="single" w:color="CCCCCC" w:sz="1"/>
-            </w:tcBorders>
-            <w:shd w:fill="FFFFFF" w:val="clear"/>
-            <w:tcMar>
-              <w:top w:type="dxa" w:w="80"/>
-              <w:left w:type="dxa" w:w="120"/>
-              <w:bottom w:type="dxa" w:w="80"/>
-              <w:right w:type="dxa" w:w="120"/>
-            </w:tcMar>
-          </w:tcPr>
-          <w:p>
-            <w:r>
-              <w:rPr>
-                <w:rFonts w:ascii="Arial" w:cs="Arial" w:eastAsia="Arial" w:hAnsi="Arial"/>
-                <w:color w:val="333333"/>
-                <w:sz w:val="20"/>
-                <w:szCs w:val="20"/>
-              </w:rPr>
-              <w:t xml:space="preserve">PayHere payment integration + webhook testing</w:t>
-            </w:r>
-          </w:p>
-        </w:tc>
-        <w:tc>
-          <w:tcPr>
-            <w:tcW w:type="dxa" w:w="2640"/>
-            <w:tcBorders>
-              <w:top w:val="single" w:color="CCCCCC" w:sz="1"/>
-              <w:left w:val="single" w:color="CCCCCC" w:sz="1"/>
-              <w:bottom w:val="single" w:color="CCCCCC" w:sz="1"/>
-              <w:right w:val="single" w:color="CCCCCC" w:sz="1"/>
-            </w:tcBorders>
-            <w:shd w:fill="FFFFFF" w:val="clear"/>
-            <w:tcMar>
-              <w:top w:type="dxa" w:w="80"/>
-              <w:left w:type="dxa" w:w="120"/>
-              <w:bottom w:type="dxa" w:w="80"/>
-              <w:right w:type="dxa" w:w="120"/>
-            </w:tcMar>
-          </w:tcPr>
-          <w:p>
-            <w:r>
-              <w:rPr>
-                <w:rFonts w:ascii="Arial" w:cs="Arial" w:eastAsia="Arial" w:hAnsi="Arial"/>
-                <w:color w:val="333333"/>
-                <w:sz w:val="20"/>
-                <w:szCs w:val="20"/>
-              </w:rPr>
-              <w:t xml:space="preserve">PayHere (LK)</w:t>
-            </w:r>
-          </w:p>
-        </w:tc>
-        <w:tc>
-          <w:tcPr>
-            <w:tcW w:type="dxa" w:w="2640"/>
-            <w:tcBorders>
-              <w:top w:val="single" w:color="CCCCCC" w:sz="1"/>
-              <w:left w:val="single" w:color="CCCCCC" w:sz="1"/>
-              <w:bottom w:val="single" w:color="CCCCCC" w:sz="1"/>
-              <w:right w:val="single" w:color="CCCCCC" w:sz="1"/>
-            </w:tcBorders>
-            <w:shd w:fill="FFFFFF" w:val="clear"/>
-            <w:tcMar>
-              <w:top w:type="dxa" w:w="80"/>
-              <w:left w:type="dxa" w:w="120"/>
-              <w:bottom w:type="dxa" w:w="80"/>
-              <w:right w:type="dxa" w:w="120"/>
-            </w:tcMar>
-          </w:tcPr>
-          <w:p>
-            <w:r>
-              <w:rPr>
-                <w:rFonts w:ascii="Arial" w:cs="Arial" w:eastAsia="Arial" w:hAnsi="Arial"/>
-                <w:color w:val="333333"/>
-                <w:sz w:val="20"/>
-                <w:szCs w:val="20"/>
-              </w:rPr>
-              <w:t>Rs. 8,000</w:t>
-            </w:r>
-          </w:p>
-        </w:tc>
-      </w:tr>
-      <w:tr>
-        <w:tc>
-          <w:tcPr>
-            <w:tcW w:type="dxa" w:w="4080"/>
+              <w:t xml:space="preserve">Cost (LKR)</w:t>
+            </w:r>
+          </w:p>
+        </w:tc>
+      </w:tr>
+      <w:tr>
+        <w:tc>
+          <w:tcPr>
+            <w:tcW w:type="dxa" w:w="6000"/>
+            <w:tcBorders>
+              <w:top w:val="single" w:color="CCCCCC" w:sz="1"/>
+              <w:left w:val="single" w:color="CCCCCC" w:sz="1"/>
+              <w:bottom w:val="single" w:color="CCCCCC" w:sz="1"/>
+              <w:right w:val="single" w:color="CCCCCC" w:sz="1"/>
+            </w:tcBorders>
+            <w:shd w:fill="FFFFFF" w:val="clear"/>
+            <w:tcMar>
+              <w:top w:type="dxa" w:w="80"/>
+              <w:left w:type="dxa" w:w="120"/>
+              <w:bottom w:type="dxa" w:w="80"/>
+              <w:right w:type="dxa" w:w="120"/>
+            </w:tcMar>
+          </w:tcPr>
+          <w:p>
+            <w:r>
+              <w:rPr>
+                <w:rFonts w:ascii="Arial" w:cs="Arial" w:eastAsia="Arial" w:hAnsi="Arial"/>
+                <w:color w:val="333333"/>
+                <w:sz w:val="20"/>
+                <w:szCs w:val="20"/>
+              </w:rPr>
+              <w:t xml:space="preserve">Functional QA — manual testing of all user flows across Customer App, Worker App, Website, and Admin</w:t>
+            </w:r>
+          </w:p>
+        </w:tc>
+        <w:tc>
+          <w:tcPr>
+            <w:tcW w:type="dxa" w:w="3360"/>
+            <w:tcBorders>
+              <w:top w:val="single" w:color="CCCCCC" w:sz="1"/>
+              <w:left w:val="single" w:color="CCCCCC" w:sz="1"/>
+              <w:bottom w:val="single" w:color="CCCCCC" w:sz="1"/>
+              <w:right w:val="single" w:color="CCCCCC" w:sz="1"/>
+            </w:tcBorders>
+            <w:shd w:fill="FFFFFF" w:val="clear"/>
+            <w:tcMar>
+              <w:top w:type="dxa" w:w="80"/>
+              <w:left w:type="dxa" w:w="120"/>
+              <w:bottom w:type="dxa" w:w="80"/>
+              <w:right w:type="dxa" w:w="120"/>
+            </w:tcMar>
+          </w:tcPr>
+          <w:p>
+            <w:r>
+              <w:rPr>
+                <w:rFonts w:ascii="Arial" w:cs="Arial" w:eastAsia="Arial" w:hAnsi="Arial"/>
+                <w:color w:val="333333"/>
+                <w:sz w:val="20"/>
+                <w:szCs w:val="20"/>
+              </w:rPr>
+              <w:t>Rs. 40,000</w:t>
+            </w:r>
+          </w:p>
+        </w:tc>
+      </w:tr>
+      <w:tr>
+        <w:tc>
+          <w:tcPr>
+            <w:tcW w:type="dxa" w:w="6000"/>
             <w:tcBorders>
               <w:top w:val="single" w:color="CCCCCC" w:sz="1"/>
               <w:left w:val="single" w:color="CCCCCC" w:sz="1"/>
@@ -12304,13 +12250,13 @@
                 <w:sz w:val="20"/>
                 <w:szCs w:val="20"/>
               </w:rPr>
-              <w:t xml:space="preserve">Stripe subscription billing + card vault</w:t>
-            </w:r>
-          </w:p>
-        </w:tc>
-        <w:tc>
-          <w:tcPr>
-            <w:tcW w:type="dxa" w:w="2640"/>
+              <w:t xml:space="preserve">API load testing — 200 concurrent users on booking and dispatch endpoints</w:t>
+            </w:r>
+          </w:p>
+        </w:tc>
+        <w:tc>
+          <w:tcPr>
+            <w:tcW w:type="dxa" w:w="3360"/>
             <w:tcBorders>
               <w:top w:val="single" w:color="CCCCCC" w:sz="1"/>
               <w:left w:val="single" w:color="CCCCCC" w:sz="1"/>
@@ -12333,13 +12279,75 @@
                 <w:sz w:val="20"/>
                 <w:szCs w:val="20"/>
               </w:rPr>
-              <w:t xml:space="preserve">Stripe</w:t>
-            </w:r>
-          </w:p>
-        </w:tc>
-        <w:tc>
-          <w:tcPr>
-            <w:tcW w:type="dxa" w:w="2640"/>
+              <w:t>Rs. 10,000</w:t>
+            </w:r>
+          </w:p>
+        </w:tc>
+      </w:tr>
+      <w:tr>
+        <w:tc>
+          <w:tcPr>
+            <w:tcW w:type="dxa" w:w="6000"/>
+            <w:tcBorders>
+              <w:top w:val="single" w:color="CCCCCC" w:sz="1"/>
+              <w:left w:val="single" w:color="CCCCCC" w:sz="1"/>
+              <w:bottom w:val="single" w:color="CCCCCC" w:sz="1"/>
+              <w:right w:val="single" w:color="CCCCCC" w:sz="1"/>
+            </w:tcBorders>
+            <w:shd w:fill="FFFFFF" w:val="clear"/>
+            <w:tcMar>
+              <w:top w:type="dxa" w:w="80"/>
+              <w:left w:type="dxa" w:w="120"/>
+              <w:bottom w:type="dxa" w:w="80"/>
+              <w:right w:type="dxa" w:w="120"/>
+            </w:tcMar>
+          </w:tcPr>
+          <w:p>
+            <w:r>
+              <w:rPr>
+                <w:rFonts w:ascii="Arial" w:cs="Arial" w:eastAsia="Arial" w:hAnsi="Arial"/>
+                <w:color w:val="333333"/>
+                <w:sz w:val="20"/>
+                <w:szCs w:val="20"/>
+              </w:rPr>
+              <w:t xml:space="preserve">Security review — OWASP Top 10 check on auth, payment, and file upload flows</w:t>
+            </w:r>
+          </w:p>
+        </w:tc>
+        <w:tc>
+          <w:tcPr>
+            <w:tcW w:type="dxa" w:w="3360"/>
+            <w:tcBorders>
+              <w:top w:val="single" w:color="CCCCCC" w:sz="1"/>
+              <w:left w:val="single" w:color="CCCCCC" w:sz="1"/>
+              <w:bottom w:val="single" w:color="CCCCCC" w:sz="1"/>
+              <w:right w:val="single" w:color="CCCCCC" w:sz="1"/>
+            </w:tcBorders>
+            <w:shd w:fill="FFFFFF" w:val="clear"/>
+            <w:tcMar>
+              <w:top w:type="dxa" w:w="80"/>
+              <w:left w:type="dxa" w:w="120"/>
+              <w:bottom w:type="dxa" w:w="80"/>
+              <w:right w:type="dxa" w:w="120"/>
+            </w:tcMar>
+          </w:tcPr>
+          <w:p>
+            <w:r>
+              <w:rPr>
+                <w:rFonts w:ascii="Arial" w:cs="Arial" w:eastAsia="Arial" w:hAnsi="Arial"/>
+                <w:color w:val="333333"/>
+                <w:sz w:val="20"/>
+                <w:szCs w:val="20"/>
+              </w:rPr>
+              <w:t>Rs. 20,000</w:t>
+            </w:r>
+          </w:p>
+        </w:tc>
+      </w:tr>
+      <w:tr>
+        <w:tc>
+          <w:tcPr>
+            <w:tcW w:type="dxa" w:w="6000"/>
             <w:tcBorders>
               <w:top w:val="single" w:color="CCCCCC" w:sz="1"/>
               <w:left w:val="single" w:color="CCCCCC" w:sz="1"/>
@@ -12362,104 +12370,13 @@
                 <w:sz w:val="20"/>
                 <w:szCs w:val="20"/>
               </w:rPr>
-              <w:t>Rs. 7,000</w:t>
-            </w:r>
-          </w:p>
-        </w:tc>
-      </w:tr>
-      <w:tr>
-        <w:tc>
-          <w:tcPr>
-            <w:tcW w:type="dxa" w:w="4080"/>
-            <w:tcBorders>
-              <w:top w:val="single" w:color="CCCCCC" w:sz="1"/>
-              <w:left w:val="single" w:color="CCCCCC" w:sz="1"/>
-              <w:bottom w:val="single" w:color="CCCCCC" w:sz="1"/>
-              <w:right w:val="single" w:color="CCCCCC" w:sz="1"/>
-            </w:tcBorders>
-            <w:shd w:fill="FFFFFF" w:val="clear"/>
-            <w:tcMar>
-              <w:top w:type="dxa" w:w="80"/>
-              <w:left w:type="dxa" w:w="120"/>
-              <w:bottom w:type="dxa" w:w="80"/>
-              <w:right w:type="dxa" w:w="120"/>
-            </w:tcMar>
-          </w:tcPr>
-          <w:p>
-            <w:r>
-              <w:rPr>
-                <w:rFonts w:ascii="Arial" w:cs="Arial" w:eastAsia="Arial" w:hAnsi="Arial"/>
-                <w:color w:val="333333"/>
-                <w:sz w:val="20"/>
-                <w:szCs w:val="20"/>
-              </w:rPr>
-              <w:t xml:space="preserve">Google Maps Platform API setup and optimisation</w:t>
-            </w:r>
-          </w:p>
-        </w:tc>
-        <w:tc>
-          <w:tcPr>
-            <w:tcW w:type="dxa" w:w="2640"/>
-            <w:tcBorders>
-              <w:top w:val="single" w:color="CCCCCC" w:sz="1"/>
-              <w:left w:val="single" w:color="CCCCCC" w:sz="1"/>
-              <w:bottom w:val="single" w:color="CCCCCC" w:sz="1"/>
-              <w:right w:val="single" w:color="CCCCCC" w:sz="1"/>
-            </w:tcBorders>
-            <w:shd w:fill="FFFFFF" w:val="clear"/>
-            <w:tcMar>
-              <w:top w:type="dxa" w:w="80"/>
-              <w:left w:type="dxa" w:w="120"/>
-              <w:bottom w:type="dxa" w:w="80"/>
-              <w:right w:type="dxa" w:w="120"/>
-            </w:tcMar>
-          </w:tcPr>
-          <w:p>
-            <w:r>
-              <w:rPr>
-                <w:rFonts w:ascii="Arial" w:cs="Arial" w:eastAsia="Arial" w:hAnsi="Arial"/>
-                <w:color w:val="333333"/>
-                <w:sz w:val="20"/>
-                <w:szCs w:val="20"/>
-              </w:rPr>
-              <w:t xml:space="preserve">Google Cloud</w:t>
-            </w:r>
-          </w:p>
-        </w:tc>
-        <w:tc>
-          <w:tcPr>
-            <w:tcW w:type="dxa" w:w="2640"/>
-            <w:tcBorders>
-              <w:top w:val="single" w:color="CCCCCC" w:sz="1"/>
-              <w:left w:val="single" w:color="CCCCCC" w:sz="1"/>
-              <w:bottom w:val="single" w:color="CCCCCC" w:sz="1"/>
-              <w:right w:val="single" w:color="CCCCCC" w:sz="1"/>
-            </w:tcBorders>
-            <w:shd w:fill="FFFFFF" w:val="clear"/>
-            <w:tcMar>
-              <w:top w:type="dxa" w:w="80"/>
-              <w:left w:type="dxa" w:w="120"/>
-              <w:bottom w:type="dxa" w:w="80"/>
-              <w:right w:type="dxa" w:w="120"/>
-            </w:tcMar>
-          </w:tcPr>
-          <w:p>
-            <w:r>
-              <w:rPr>
-                <w:rFonts w:ascii="Arial" w:cs="Arial" w:eastAsia="Arial" w:hAnsi="Arial"/>
-                <w:color w:val="333333"/>
-                <w:sz w:val="20"/>
-                <w:szCs w:val="20"/>
-              </w:rPr>
-              <w:t>Rs. 7,000</w:t>
-            </w:r>
-          </w:p>
-        </w:tc>
-      </w:tr>
-      <w:tr>
-        <w:tc>
-          <w:tcPr>
-            <w:tcW w:type="dxa" w:w="4080"/>
+              <w:t xml:space="preserve">Device compatibility testing — 5 iOS + 5 Android device configurations</w:t>
+            </w:r>
+          </w:p>
+        </w:tc>
+        <w:tc>
+          <w:tcPr>
+            <w:tcW w:type="dxa" w:w="3360"/>
             <w:tcBorders>
               <w:top w:val="single" w:color="CCCCCC" w:sz="1"/>
               <w:left w:val="single" w:color="CCCCCC" w:sz="1"/>
@@ -12482,429 +12399,15 @@
                 <w:sz w:val="20"/>
                 <w:szCs w:val="20"/>
               </w:rPr>
-              <w:t xml:space="preserve">Firebase project setup — FCM + Realtime Database</w:t>
-            </w:r>
-          </w:p>
-        </w:tc>
-        <w:tc>
-          <w:tcPr>
-            <w:tcW w:type="dxa" w:w="2640"/>
-            <w:tcBorders>
-              <w:top w:val="single" w:color="CCCCCC" w:sz="1"/>
-              <w:left w:val="single" w:color="CCCCCC" w:sz="1"/>
-              <w:bottom w:val="single" w:color="CCCCCC" w:sz="1"/>
-              <w:right w:val="single" w:color="CCCCCC" w:sz="1"/>
-            </w:tcBorders>
-            <w:shd w:fill="F0F6FA" w:val="clear"/>
-            <w:tcMar>
-              <w:top w:type="dxa" w:w="80"/>
-              <w:left w:type="dxa" w:w="120"/>
-              <w:bottom w:type="dxa" w:w="80"/>
-              <w:right w:type="dxa" w:w="120"/>
-            </w:tcMar>
-          </w:tcPr>
-          <w:p>
-            <w:r>
-              <w:rPr>
-                <w:rFonts w:ascii="Arial" w:cs="Arial" w:eastAsia="Arial" w:hAnsi="Arial"/>
-                <w:color w:val="333333"/>
-                <w:sz w:val="20"/>
-                <w:szCs w:val="20"/>
-              </w:rPr>
-              <w:t xml:space="preserve">Firebase</w:t>
-            </w:r>
-          </w:p>
-        </w:tc>
-        <w:tc>
-          <w:tcPr>
-            <w:tcW w:type="dxa" w:w="2640"/>
-            <w:tcBorders>
-              <w:top w:val="single" w:color="CCCCCC" w:sz="1"/>
-              <w:left w:val="single" w:color="CCCCCC" w:sz="1"/>
-              <w:bottom w:val="single" w:color="CCCCCC" w:sz="1"/>
-              <w:right w:val="single" w:color="CCCCCC" w:sz="1"/>
-            </w:tcBorders>
-            <w:shd w:fill="F0F6FA" w:val="clear"/>
-            <w:tcMar>
-              <w:top w:type="dxa" w:w="80"/>
-              <w:left w:type="dxa" w:w="120"/>
-              <w:bottom w:type="dxa" w:w="80"/>
-              <w:right w:type="dxa" w:w="120"/>
-            </w:tcMar>
-          </w:tcPr>
-          <w:p>
-            <w:r>
-              <w:rPr>
-                <w:rFonts w:ascii="Arial" w:cs="Arial" w:eastAsia="Arial" w:hAnsi="Arial"/>
-                <w:color w:val="333333"/>
-                <w:sz w:val="20"/>
-                <w:szCs w:val="20"/>
-              </w:rPr>
-              <w:t>Rs. 5,000</w:t>
-            </w:r>
-          </w:p>
-        </w:tc>
-      </w:tr>
-      <w:tr>
-        <w:tc>
-          <w:tcPr>
-            <w:tcW w:type="dxa" w:w="4080"/>
-            <w:tcBorders>
-              <w:top w:val="single" w:color="CCCCCC" w:sz="1"/>
-              <w:left w:val="single" w:color="CCCCCC" w:sz="1"/>
-              <w:bottom w:val="single" w:color="CCCCCC" w:sz="1"/>
-              <w:right w:val="single" w:color="CCCCCC" w:sz="1"/>
-            </w:tcBorders>
-            <w:shd w:fill="FFFFFF" w:val="clear"/>
-            <w:tcMar>
-              <w:top w:type="dxa" w:w="80"/>
-              <w:left w:type="dxa" w:w="120"/>
-              <w:bottom w:type="dxa" w:w="80"/>
-              <w:right w:type="dxa" w:w="120"/>
-            </w:tcMar>
-          </w:tcPr>
-          <w:p>
-            <w:r>
-              <w:rPr>
-                <w:rFonts w:ascii="Arial" w:cs="Arial" w:eastAsia="Arial" w:hAnsi="Arial"/>
-                <w:color w:val="333333"/>
-                <w:sz w:val="20"/>
-                <w:szCs w:val="20"/>
-              </w:rPr>
-              <w:t xml:space="preserve">SMS OTP integration — Dialog / Mobitel API</w:t>
-            </w:r>
-          </w:p>
-        </w:tc>
-        <w:tc>
-          <w:tcPr>
-            <w:tcW w:type="dxa" w:w="2640"/>
-            <w:tcBorders>
-              <w:top w:val="single" w:color="CCCCCC" w:sz="1"/>
-              <w:left w:val="single" w:color="CCCCCC" w:sz="1"/>
-              <w:bottom w:val="single" w:color="CCCCCC" w:sz="1"/>
-              <w:right w:val="single" w:color="CCCCCC" w:sz="1"/>
-            </w:tcBorders>
-            <w:shd w:fill="FFFFFF" w:val="clear"/>
-            <w:tcMar>
-              <w:top w:type="dxa" w:w="80"/>
-              <w:left w:type="dxa" w:w="120"/>
-              <w:bottom w:type="dxa" w:w="80"/>
-              <w:right w:type="dxa" w:w="120"/>
-            </w:tcMar>
-          </w:tcPr>
-          <w:p>
-            <w:r>
-              <w:rPr>
-                <w:rFonts w:ascii="Arial" w:cs="Arial" w:eastAsia="Arial" w:hAnsi="Arial"/>
-                <w:color w:val="333333"/>
-                <w:sz w:val="20"/>
-                <w:szCs w:val="20"/>
-              </w:rPr>
-              <w:t xml:space="preserve">Dialog/Mobitel</w:t>
-            </w:r>
-          </w:p>
-        </w:tc>
-        <w:tc>
-          <w:tcPr>
-            <w:tcW w:type="dxa" w:w="2640"/>
-            <w:tcBorders>
-              <w:top w:val="single" w:color="CCCCCC" w:sz="1"/>
-              <w:left w:val="single" w:color="CCCCCC" w:sz="1"/>
-              <w:bottom w:val="single" w:color="CCCCCC" w:sz="1"/>
-              <w:right w:val="single" w:color="CCCCCC" w:sz="1"/>
-            </w:tcBorders>
-            <w:shd w:fill="FFFFFF" w:val="clear"/>
-            <w:tcMar>
-              <w:top w:type="dxa" w:w="80"/>
-              <w:left w:type="dxa" w:w="120"/>
-              <w:bottom w:type="dxa" w:w="80"/>
-              <w:right w:type="dxa" w:w="120"/>
-            </w:tcMar>
-          </w:tcPr>
-          <w:p>
-            <w:r>
-              <w:rPr>
-                <w:rFonts w:ascii="Arial" w:cs="Arial" w:eastAsia="Arial" w:hAnsi="Arial"/>
-                <w:color w:val="333333"/>
-                <w:sz w:val="20"/>
-                <w:szCs w:val="20"/>
-              </w:rPr>
-              <w:t>Rs. 5,000</w:t>
-            </w:r>
-          </w:p>
-        </w:tc>
-      </w:tr>
-      <w:tr>
-        <w:tc>
-          <w:tcPr>
-            <w:tcW w:type="dxa" w:w="4080"/>
-            <w:tcBorders>
-              <w:top w:val="single" w:color="CCCCCC" w:sz="1"/>
-              <w:left w:val="single" w:color="CCCCCC" w:sz="1"/>
-              <w:bottom w:val="single" w:color="CCCCCC" w:sz="1"/>
-              <w:right w:val="single" w:color="CCCCCC" w:sz="1"/>
-            </w:tcBorders>
-            <w:shd w:fill="F0F6FA" w:val="clear"/>
-            <w:tcMar>
-              <w:top w:type="dxa" w:w="80"/>
-              <w:left w:type="dxa" w:w="120"/>
-              <w:bottom w:type="dxa" w:w="80"/>
-              <w:right w:type="dxa" w:w="120"/>
-            </w:tcMar>
-          </w:tcPr>
-          <w:p>
-            <w:r>
-              <w:rPr>
-                <w:rFonts w:ascii="Arial" w:cs="Arial" w:eastAsia="Arial" w:hAnsi="Arial"/>
-                <w:color w:val="333333"/>
-                <w:sz w:val="20"/>
-                <w:szCs w:val="20"/>
-              </w:rPr>
-              <w:t xml:space="preserve">SendGrid transactional email setup</w:t>
-            </w:r>
-          </w:p>
-        </w:tc>
-        <w:tc>
-          <w:tcPr>
-            <w:tcW w:type="dxa" w:w="2640"/>
-            <w:tcBorders>
-              <w:top w:val="single" w:color="CCCCCC" w:sz="1"/>
-              <w:left w:val="single" w:color="CCCCCC" w:sz="1"/>
-              <w:bottom w:val="single" w:color="CCCCCC" w:sz="1"/>
-              <w:right w:val="single" w:color="CCCCCC" w:sz="1"/>
-            </w:tcBorders>
-            <w:shd w:fill="F0F6FA" w:val="clear"/>
-            <w:tcMar>
-              <w:top w:type="dxa" w:w="80"/>
-              <w:left w:type="dxa" w:w="120"/>
-              <w:bottom w:type="dxa" w:w="80"/>
-              <w:right w:type="dxa" w:w="120"/>
-            </w:tcMar>
-          </w:tcPr>
-          <w:p>
-            <w:r>
-              <w:rPr>
-                <w:rFonts w:ascii="Arial" w:cs="Arial" w:eastAsia="Arial" w:hAnsi="Arial"/>
-                <w:color w:val="333333"/>
-                <w:sz w:val="20"/>
-                <w:szCs w:val="20"/>
-              </w:rPr>
-              <w:t xml:space="preserve">SendGrid</w:t>
-            </w:r>
-          </w:p>
-        </w:tc>
-        <w:tc>
-          <w:tcPr>
-            <w:tcW w:type="dxa" w:w="2640"/>
-            <w:tcBorders>
-              <w:top w:val="single" w:color="CCCCCC" w:sz="1"/>
-              <w:left w:val="single" w:color="CCCCCC" w:sz="1"/>
-              <w:bottom w:val="single" w:color="CCCCCC" w:sz="1"/>
-              <w:right w:val="single" w:color="CCCCCC" w:sz="1"/>
-            </w:tcBorders>
-            <w:shd w:fill="F0F6FA" w:val="clear"/>
-            <w:tcMar>
-              <w:top w:type="dxa" w:w="80"/>
-              <w:left w:type="dxa" w:w="120"/>
-              <w:bottom w:type="dxa" w:w="80"/>
-              <w:right w:type="dxa" w:w="120"/>
-            </w:tcMar>
-          </w:tcPr>
-          <w:p>
-            <w:r>
-              <w:rPr>
-                <w:rFonts w:ascii="Arial" w:cs="Arial" w:eastAsia="Arial" w:hAnsi="Arial"/>
-                <w:color w:val="333333"/>
-                <w:sz w:val="20"/>
-                <w:szCs w:val="20"/>
-              </w:rPr>
-              <w:t>Rs. 5,000</w:t>
-            </w:r>
-          </w:p>
-        </w:tc>
-      </w:tr>
-      <w:tr>
-        <w:tc>
-          <w:tcPr>
-            <w:tcW w:type="dxa" w:w="4080"/>
-            <w:tcBorders>
-              <w:top w:val="single" w:color="CCCCCC" w:sz="1"/>
-              <w:left w:val="single" w:color="CCCCCC" w:sz="1"/>
-              <w:bottom w:val="single" w:color="CCCCCC" w:sz="1"/>
-              <w:right w:val="single" w:color="CCCCCC" w:sz="1"/>
-            </w:tcBorders>
-            <w:shd w:fill="FFFFFF" w:val="clear"/>
-            <w:tcMar>
-              <w:top w:type="dxa" w:w="80"/>
-              <w:left w:type="dxa" w:w="120"/>
-              <w:bottom w:type="dxa" w:w="80"/>
-              <w:right w:type="dxa" w:w="120"/>
-            </w:tcMar>
-          </w:tcPr>
-          <w:p>
-            <w:r>
-              <w:rPr>
-                <w:rFonts w:ascii="Arial" w:cs="Arial" w:eastAsia="Arial" w:hAnsi="Arial"/>
-                <w:color w:val="333333"/>
-                <w:sz w:val="20"/>
-                <w:szCs w:val="20"/>
-              </w:rPr>
-              <w:t xml:space="preserve">AWS S3 or Cloudflare R2 file storage setup</w:t>
-            </w:r>
-          </w:p>
-        </w:tc>
-        <w:tc>
-          <w:tcPr>
-            <w:tcW w:type="dxa" w:w="2640"/>
-            <w:tcBorders>
-              <w:top w:val="single" w:color="CCCCCC" w:sz="1"/>
-              <w:left w:val="single" w:color="CCCCCC" w:sz="1"/>
-              <w:bottom w:val="single" w:color="CCCCCC" w:sz="1"/>
-              <w:right w:val="single" w:color="CCCCCC" w:sz="1"/>
-            </w:tcBorders>
-            <w:shd w:fill="FFFFFF" w:val="clear"/>
-            <w:tcMar>
-              <w:top w:type="dxa" w:w="80"/>
-              <w:left w:type="dxa" w:w="120"/>
-              <w:bottom w:type="dxa" w:w="80"/>
-              <w:right w:type="dxa" w:w="120"/>
-            </w:tcMar>
-          </w:tcPr>
-          <w:p>
-            <w:r>
-              <w:rPr>
-                <w:rFonts w:ascii="Arial" w:cs="Arial" w:eastAsia="Arial" w:hAnsi="Arial"/>
-                <w:color w:val="333333"/>
-                <w:sz w:val="20"/>
-                <w:szCs w:val="20"/>
-              </w:rPr>
-              <w:t xml:space="preserve">AWS/Cloudflare</w:t>
-            </w:r>
-          </w:p>
-        </w:tc>
-        <w:tc>
-          <w:tcPr>
-            <w:tcW w:type="dxa" w:w="2640"/>
-            <w:tcBorders>
-              <w:top w:val="single" w:color="CCCCCC" w:sz="1"/>
-              <w:left w:val="single" w:color="CCCCCC" w:sz="1"/>
-              <w:bottom w:val="single" w:color="CCCCCC" w:sz="1"/>
-              <w:right w:val="single" w:color="CCCCCC" w:sz="1"/>
-            </w:tcBorders>
-            <w:shd w:fill="FFFFFF" w:val="clear"/>
-            <w:tcMar>
-              <w:top w:type="dxa" w:w="80"/>
-              <w:left w:type="dxa" w:w="120"/>
-              <w:bottom w:type="dxa" w:w="80"/>
-              <w:right w:type="dxa" w:w="120"/>
-            </w:tcMar>
-          </w:tcPr>
-          <w:p>
-            <w:r>
-              <w:rPr>
-                <w:rFonts w:ascii="Arial" w:cs="Arial" w:eastAsia="Arial" w:hAnsi="Arial"/>
-                <w:color w:val="333333"/>
-                <w:sz w:val="20"/>
-                <w:szCs w:val="20"/>
-              </w:rPr>
-              <w:t>Rs. 5,000</w:t>
-            </w:r>
-          </w:p>
-        </w:tc>
-      </w:tr>
-      <w:tr>
-        <w:tc>
-          <w:tcPr>
-            <w:tcW w:type="dxa" w:w="4080"/>
-            <w:tcBorders>
-              <w:top w:val="single" w:color="CCCCCC" w:sz="1"/>
-              <w:left w:val="single" w:color="CCCCCC" w:sz="1"/>
-              <w:bottom w:val="single" w:color="CCCCCC" w:sz="1"/>
-              <w:right w:val="single" w:color="CCCCCC" w:sz="1"/>
-            </w:tcBorders>
-            <w:shd w:fill="F0F6FA" w:val="clear"/>
-            <w:tcMar>
-              <w:top w:type="dxa" w:w="80"/>
-              <w:left w:type="dxa" w:w="120"/>
-              <w:bottom w:type="dxa" w:w="80"/>
-              <w:right w:type="dxa" w:w="120"/>
-            </w:tcMar>
-          </w:tcPr>
-          <w:p>
-            <w:r>
-              <w:rPr>
-                <w:rFonts w:ascii="Arial" w:cs="Arial" w:eastAsia="Arial" w:hAnsi="Arial"/>
-                <w:color w:val="333333"/>
-                <w:sz w:val="20"/>
-                <w:szCs w:val="20"/>
-              </w:rPr>
-              <w:t xml:space="preserve">Sentry error monitoring setup and alerts configuration</w:t>
-            </w:r>
-          </w:p>
-        </w:tc>
-        <w:tc>
-          <w:tcPr>
-            <w:tcW w:type="dxa" w:w="2640"/>
-            <w:tcBorders>
-              <w:top w:val="single" w:color="CCCCCC" w:sz="1"/>
-              <w:left w:val="single" w:color="CCCCCC" w:sz="1"/>
-              <w:bottom w:val="single" w:color="CCCCCC" w:sz="1"/>
-              <w:right w:val="single" w:color="CCCCCC" w:sz="1"/>
-            </w:tcBorders>
-            <w:shd w:fill="F0F6FA" w:val="clear"/>
-            <w:tcMar>
-              <w:top w:type="dxa" w:w="80"/>
-              <w:left w:type="dxa" w:w="120"/>
-              <w:bottom w:type="dxa" w:w="80"/>
-              <w:right w:type="dxa" w:w="120"/>
-            </w:tcMar>
-          </w:tcPr>
-          <w:p>
-            <w:r>
-              <w:rPr>
-                <w:rFonts w:ascii="Arial" w:cs="Arial" w:eastAsia="Arial" w:hAnsi="Arial"/>
-                <w:color w:val="333333"/>
-                <w:sz w:val="20"/>
-                <w:szCs w:val="20"/>
-              </w:rPr>
-              <w:t xml:space="preserve">Sentry.io</w:t>
-            </w:r>
-          </w:p>
-        </w:tc>
-        <w:tc>
-          <w:tcPr>
-            <w:tcW w:type="dxa" w:w="2640"/>
-            <w:tcBorders>
-              <w:top w:val="single" w:color="CCCCCC" w:sz="1"/>
-              <w:left w:val="single" w:color="CCCCCC" w:sz="1"/>
-              <w:bottom w:val="single" w:color="CCCCCC" w:sz="1"/>
-              <w:right w:val="single" w:color="CCCCCC" w:sz="1"/>
-            </w:tcBorders>
-            <w:shd w:fill="F0F6FA" w:val="clear"/>
-            <w:tcMar>
-              <w:top w:type="dxa" w:w="80"/>
-              <w:left w:type="dxa" w:w="120"/>
-              <w:bottom w:type="dxa" w:w="80"/>
-              <w:right w:type="dxa" w:w="120"/>
-            </w:tcMar>
-          </w:tcPr>
-          <w:p>
-            <w:r>
-              <w:rPr>
-                <w:rFonts w:ascii="Arial" w:cs="Arial" w:eastAsia="Arial" w:hAnsi="Arial"/>
-                <w:color w:val="333333"/>
-                <w:sz w:val="20"/>
-                <w:szCs w:val="20"/>
-              </w:rPr>
-              <w:t>Rs. 8,000</w:t>
-            </w:r>
-          </w:p>
-        </w:tc>
-      </w:tr>
-      <w:tr>
-        <w:tc>
-          <w:tcPr>
-            <w:tcW w:type="dxa" w:w="4080"/>
+              <w:t>Rs. 10,000</w:t>
+            </w:r>
+          </w:p>
+        </w:tc>
+      </w:tr>
+      <w:tr>
+        <w:tc>
+          <w:tcPr>
+            <w:tcW w:type="dxa" w:w="6000"/>
             <w:tcBorders>
               <w:top w:val="single" w:color="CCCCCC" w:sz="1"/>
               <w:left w:val="single" w:color="CCCCCC" w:sz="1"/>
@@ -12929,13 +12432,13 @@
                 <w:sz w:val="21"/>
                 <w:szCs w:val="21"/>
               </w:rPr>
-              <w:t xml:space="preserve">Integration Subtotal</w:t>
-            </w:r>
-          </w:p>
-        </w:tc>
-        <w:tc>
-          <w:tcPr>
-            <w:tcW w:type="dxa" w:w="2640"/>
+              <w:t xml:space="preserve">QA Subtotal</w:t>
+            </w:r>
+          </w:p>
+        </w:tc>
+        <w:tc>
+          <w:tcPr>
+            <w:tcW w:type="dxa" w:w="3360"/>
             <w:tcBorders>
               <w:top w:val="single" w:color="CCCCCC" w:sz="1"/>
               <w:left w:val="single" w:color="CCCCCC" w:sz="1"/>
@@ -12960,38 +12463,7 @@
                 <w:sz w:val="21"/>
                 <w:szCs w:val="21"/>
               </w:rPr>
-              <w:t xml:space="preserve"/>
-            </w:r>
-          </w:p>
-        </w:tc>
-        <w:tc>
-          <w:tcPr>
-            <w:tcW w:type="dxa" w:w="2640"/>
-            <w:tcBorders>
-              <w:top w:val="single" w:color="CCCCCC" w:sz="1"/>
-              <w:left w:val="single" w:color="CCCCCC" w:sz="1"/>
-              <w:bottom w:val="single" w:color="CCCCCC" w:sz="1"/>
-              <w:right w:val="single" w:color="CCCCCC" w:sz="1"/>
-            </w:tcBorders>
-            <w:shd w:fill="D5E8F0" w:val="clear"/>
-            <w:tcMar>
-              <w:top w:type="dxa" w:w="80"/>
-              <w:left w:type="dxa" w:w="120"/>
-              <w:bottom w:type="dxa" w:w="80"/>
-              <w:right w:type="dxa" w:w="120"/>
-            </w:tcMar>
-          </w:tcPr>
-          <w:p>
-            <w:r>
-              <w:rPr>
-                <w:rFonts w:ascii="Arial" w:cs="Arial" w:eastAsia="Arial" w:hAnsi="Arial"/>
-                <w:b/>
-                <w:bCs/>
-                <w:color w:val="1A3C5E"/>
-                <w:sz w:val="21"/>
-                <w:szCs w:val="21"/>
-              </w:rPr>
-              <w:t>Rs. 50,000</w:t>
+              <w:t>Rs. 80,000</w:t>
             </w:r>
           </w:p>
         </w:tc>
@@ -13019,420 +12491,7 @@
           <w:sz w:val="26"/>
           <w:szCs w:val="26"/>
         </w:rPr>
-        <w:t xml:space="preserve">6.4  Quality Assurance</w:t>
-      </w:r>
-    </w:p>
-    <w:tbl>
-      <w:tblPr>
-        <w:tblW w:type="dxa" w:w="9360"/>
-        <w:tblBorders>
-          <w:top w:val="single" w:color="auto" w:sz="4"/>
-          <w:left w:val="single" w:color="auto" w:sz="4"/>
-          <w:bottom w:val="single" w:color="auto" w:sz="4"/>
-          <w:right w:val="single" w:color="auto" w:sz="4"/>
-          <w:insideH w:val="single" w:color="auto" w:sz="4"/>
-          <w:insideV w:val="single" w:color="auto" w:sz="4"/>
-        </w:tblBorders>
-      </w:tblPr>
-      <w:tblGrid>
-        <w:gridCol w:w="6000"/>
-        <w:gridCol w:w="3360"/>
-      </w:tblGrid>
-      <w:tr>
-        <w:trPr>
-          <w:tblHeader/>
-        </w:trPr>
-        <w:tc>
-          <w:tcPr>
-            <w:tcW w:type="dxa" w:w="6000"/>
-            <w:tcBorders>
-              <w:top w:val="single" w:color="CCCCCC" w:sz="1"/>
-              <w:left w:val="single" w:color="CCCCCC" w:sz="1"/>
-              <w:bottom w:val="single" w:color="CCCCCC" w:sz="1"/>
-              <w:right w:val="single" w:color="CCCCCC" w:sz="1"/>
-            </w:tcBorders>
-            <w:shd w:fill="1A3C5E" w:val="clear"/>
-            <w:tcMar>
-              <w:top w:type="dxa" w:w="80"/>
-              <w:left w:type="dxa" w:w="120"/>
-              <w:bottom w:type="dxa" w:w="80"/>
-              <w:right w:type="dxa" w:w="120"/>
-            </w:tcMar>
-          </w:tcPr>
-          <w:p>
-            <w:r>
-              <w:rPr>
-                <w:rFonts w:ascii="Arial" w:cs="Arial" w:eastAsia="Arial" w:hAnsi="Arial"/>
-                <w:b/>
-                <w:bCs/>
-                <w:color w:val="FFFFFF"/>
-                <w:sz w:val="20"/>
-                <w:szCs w:val="20"/>
-              </w:rPr>
-              <w:t xml:space="preserve">Item</w:t>
-            </w:r>
-          </w:p>
-        </w:tc>
-        <w:tc>
-          <w:tcPr>
-            <w:tcW w:type="dxa" w:w="3360"/>
-            <w:tcBorders>
-              <w:top w:val="single" w:color="CCCCCC" w:sz="1"/>
-              <w:left w:val="single" w:color="CCCCCC" w:sz="1"/>
-              <w:bottom w:val="single" w:color="CCCCCC" w:sz="1"/>
-              <w:right w:val="single" w:color="CCCCCC" w:sz="1"/>
-            </w:tcBorders>
-            <w:shd w:fill="1A3C5E" w:val="clear"/>
-            <w:tcMar>
-              <w:top w:type="dxa" w:w="80"/>
-              <w:left w:type="dxa" w:w="120"/>
-              <w:bottom w:type="dxa" w:w="80"/>
-              <w:right w:type="dxa" w:w="120"/>
-            </w:tcMar>
-          </w:tcPr>
-          <w:p>
-            <w:r>
-              <w:rPr>
-                <w:rFonts w:ascii="Arial" w:cs="Arial" w:eastAsia="Arial" w:hAnsi="Arial"/>
-                <w:b/>
-                <w:bCs/>
-                <w:color w:val="FFFFFF"/>
-                <w:sz w:val="20"/>
-                <w:szCs w:val="20"/>
-              </w:rPr>
-              <w:t xml:space="preserve">Cost (LKR)</w:t>
-            </w:r>
-          </w:p>
-        </w:tc>
-      </w:tr>
-      <w:tr>
-        <w:tc>
-          <w:tcPr>
-            <w:tcW w:type="dxa" w:w="6000"/>
-            <w:tcBorders>
-              <w:top w:val="single" w:color="CCCCCC" w:sz="1"/>
-              <w:left w:val="single" w:color="CCCCCC" w:sz="1"/>
-              <w:bottom w:val="single" w:color="CCCCCC" w:sz="1"/>
-              <w:right w:val="single" w:color="CCCCCC" w:sz="1"/>
-            </w:tcBorders>
-            <w:shd w:fill="FFFFFF" w:val="clear"/>
-            <w:tcMar>
-              <w:top w:type="dxa" w:w="80"/>
-              <w:left w:type="dxa" w:w="120"/>
-              <w:bottom w:type="dxa" w:w="80"/>
-              <w:right w:type="dxa" w:w="120"/>
-            </w:tcMar>
-          </w:tcPr>
-          <w:p>
-            <w:r>
-              <w:rPr>
-                <w:rFonts w:ascii="Arial" w:cs="Arial" w:eastAsia="Arial" w:hAnsi="Arial"/>
-                <w:color w:val="333333"/>
-                <w:sz w:val="20"/>
-                <w:szCs w:val="20"/>
-              </w:rPr>
-              <w:t xml:space="preserve">Functional QA — manual testing of all user flows across Customer App, Worker App, Website, and Admin</w:t>
-            </w:r>
-          </w:p>
-        </w:tc>
-        <w:tc>
-          <w:tcPr>
-            <w:tcW w:type="dxa" w:w="3360"/>
-            <w:tcBorders>
-              <w:top w:val="single" w:color="CCCCCC" w:sz="1"/>
-              <w:left w:val="single" w:color="CCCCCC" w:sz="1"/>
-              <w:bottom w:val="single" w:color="CCCCCC" w:sz="1"/>
-              <w:right w:val="single" w:color="CCCCCC" w:sz="1"/>
-            </w:tcBorders>
-            <w:shd w:fill="FFFFFF" w:val="clear"/>
-            <w:tcMar>
-              <w:top w:type="dxa" w:w="80"/>
-              <w:left w:type="dxa" w:w="120"/>
-              <w:bottom w:type="dxa" w:w="80"/>
-              <w:right w:type="dxa" w:w="120"/>
-            </w:tcMar>
-          </w:tcPr>
-          <w:p>
-            <w:r>
-              <w:rPr>
-                <w:rFonts w:ascii="Arial" w:cs="Arial" w:eastAsia="Arial" w:hAnsi="Arial"/>
-                <w:color w:val="333333"/>
-                <w:sz w:val="20"/>
-                <w:szCs w:val="20"/>
-              </w:rPr>
-              <w:t>Rs. 40,000</w:t>
-            </w:r>
-          </w:p>
-        </w:tc>
-      </w:tr>
-      <w:tr>
-        <w:tc>
-          <w:tcPr>
-            <w:tcW w:type="dxa" w:w="6000"/>
-            <w:tcBorders>
-              <w:top w:val="single" w:color="CCCCCC" w:sz="1"/>
-              <w:left w:val="single" w:color="CCCCCC" w:sz="1"/>
-              <w:bottom w:val="single" w:color="CCCCCC" w:sz="1"/>
-              <w:right w:val="single" w:color="CCCCCC" w:sz="1"/>
-            </w:tcBorders>
-            <w:shd w:fill="F0F6FA" w:val="clear"/>
-            <w:tcMar>
-              <w:top w:type="dxa" w:w="80"/>
-              <w:left w:type="dxa" w:w="120"/>
-              <w:bottom w:type="dxa" w:w="80"/>
-              <w:right w:type="dxa" w:w="120"/>
-            </w:tcMar>
-          </w:tcPr>
-          <w:p>
-            <w:r>
-              <w:rPr>
-                <w:rFonts w:ascii="Arial" w:cs="Arial" w:eastAsia="Arial" w:hAnsi="Arial"/>
-                <w:color w:val="333333"/>
-                <w:sz w:val="20"/>
-                <w:szCs w:val="20"/>
-              </w:rPr>
-              <w:t xml:space="preserve">API load testing — 200 concurrent users on booking and dispatch endpoints</w:t>
-            </w:r>
-          </w:p>
-        </w:tc>
-        <w:tc>
-          <w:tcPr>
-            <w:tcW w:type="dxa" w:w="3360"/>
-            <w:tcBorders>
-              <w:top w:val="single" w:color="CCCCCC" w:sz="1"/>
-              <w:left w:val="single" w:color="CCCCCC" w:sz="1"/>
-              <w:bottom w:val="single" w:color="CCCCCC" w:sz="1"/>
-              <w:right w:val="single" w:color="CCCCCC" w:sz="1"/>
-            </w:tcBorders>
-            <w:shd w:fill="F0F6FA" w:val="clear"/>
-            <w:tcMar>
-              <w:top w:type="dxa" w:w="80"/>
-              <w:left w:type="dxa" w:w="120"/>
-              <w:bottom w:type="dxa" w:w="80"/>
-              <w:right w:type="dxa" w:w="120"/>
-            </w:tcMar>
-          </w:tcPr>
-          <w:p>
-            <w:r>
-              <w:rPr>
-                <w:rFonts w:ascii="Arial" w:cs="Arial" w:eastAsia="Arial" w:hAnsi="Arial"/>
-                <w:color w:val="333333"/>
-                <w:sz w:val="20"/>
-                <w:szCs w:val="20"/>
-              </w:rPr>
-              <w:t>Rs. 10,000</w:t>
-            </w:r>
-          </w:p>
-        </w:tc>
-      </w:tr>
-      <w:tr>
-        <w:tc>
-          <w:tcPr>
-            <w:tcW w:type="dxa" w:w="6000"/>
-            <w:tcBorders>
-              <w:top w:val="single" w:color="CCCCCC" w:sz="1"/>
-              <w:left w:val="single" w:color="CCCCCC" w:sz="1"/>
-              <w:bottom w:val="single" w:color="CCCCCC" w:sz="1"/>
-              <w:right w:val="single" w:color="CCCCCC" w:sz="1"/>
-            </w:tcBorders>
-            <w:shd w:fill="FFFFFF" w:val="clear"/>
-            <w:tcMar>
-              <w:top w:type="dxa" w:w="80"/>
-              <w:left w:type="dxa" w:w="120"/>
-              <w:bottom w:type="dxa" w:w="80"/>
-              <w:right w:type="dxa" w:w="120"/>
-            </w:tcMar>
-          </w:tcPr>
-          <w:p>
-            <w:r>
-              <w:rPr>
-                <w:rFonts w:ascii="Arial" w:cs="Arial" w:eastAsia="Arial" w:hAnsi="Arial"/>
-                <w:color w:val="333333"/>
-                <w:sz w:val="20"/>
-                <w:szCs w:val="20"/>
-              </w:rPr>
-              <w:t xml:space="preserve">Security review — OWASP Top 10 check on auth, payment, and file upload flows</w:t>
-            </w:r>
-          </w:p>
-        </w:tc>
-        <w:tc>
-          <w:tcPr>
-            <w:tcW w:type="dxa" w:w="3360"/>
-            <w:tcBorders>
-              <w:top w:val="single" w:color="CCCCCC" w:sz="1"/>
-              <w:left w:val="single" w:color="CCCCCC" w:sz="1"/>
-              <w:bottom w:val="single" w:color="CCCCCC" w:sz="1"/>
-              <w:right w:val="single" w:color="CCCCCC" w:sz="1"/>
-            </w:tcBorders>
-            <w:shd w:fill="FFFFFF" w:val="clear"/>
-            <w:tcMar>
-              <w:top w:type="dxa" w:w="80"/>
-              <w:left w:type="dxa" w:w="120"/>
-              <w:bottom w:type="dxa" w:w="80"/>
-              <w:right w:type="dxa" w:w="120"/>
-            </w:tcMar>
-          </w:tcPr>
-          <w:p>
-            <w:r>
-              <w:rPr>
-                <w:rFonts w:ascii="Arial" w:cs="Arial" w:eastAsia="Arial" w:hAnsi="Arial"/>
-                <w:color w:val="333333"/>
-                <w:sz w:val="20"/>
-                <w:szCs w:val="20"/>
-              </w:rPr>
-              <w:t>Rs. 20,000</w:t>
-            </w:r>
-          </w:p>
-        </w:tc>
-      </w:tr>
-      <w:tr>
-        <w:tc>
-          <w:tcPr>
-            <w:tcW w:type="dxa" w:w="6000"/>
-            <w:tcBorders>
-              <w:top w:val="single" w:color="CCCCCC" w:sz="1"/>
-              <w:left w:val="single" w:color="CCCCCC" w:sz="1"/>
-              <w:bottom w:val="single" w:color="CCCCCC" w:sz="1"/>
-              <w:right w:val="single" w:color="CCCCCC" w:sz="1"/>
-            </w:tcBorders>
-            <w:shd w:fill="F0F6FA" w:val="clear"/>
-            <w:tcMar>
-              <w:top w:type="dxa" w:w="80"/>
-              <w:left w:type="dxa" w:w="120"/>
-              <w:bottom w:type="dxa" w:w="80"/>
-              <w:right w:type="dxa" w:w="120"/>
-            </w:tcMar>
-          </w:tcPr>
-          <w:p>
-            <w:r>
-              <w:rPr>
-                <w:rFonts w:ascii="Arial" w:cs="Arial" w:eastAsia="Arial" w:hAnsi="Arial"/>
-                <w:color w:val="333333"/>
-                <w:sz w:val="20"/>
-                <w:szCs w:val="20"/>
-              </w:rPr>
-              <w:t xml:space="preserve">Device compatibility testing — 5 iOS + 5 Android device configurations</w:t>
-            </w:r>
-          </w:p>
-        </w:tc>
-        <w:tc>
-          <w:tcPr>
-            <w:tcW w:type="dxa" w:w="3360"/>
-            <w:tcBorders>
-              <w:top w:val="single" w:color="CCCCCC" w:sz="1"/>
-              <w:left w:val="single" w:color="CCCCCC" w:sz="1"/>
-              <w:bottom w:val="single" w:color="CCCCCC" w:sz="1"/>
-              <w:right w:val="single" w:color="CCCCCC" w:sz="1"/>
-            </w:tcBorders>
-            <w:shd w:fill="F0F6FA" w:val="clear"/>
-            <w:tcMar>
-              <w:top w:type="dxa" w:w="80"/>
-              <w:left w:type="dxa" w:w="120"/>
-              <w:bottom w:type="dxa" w:w="80"/>
-              <w:right w:type="dxa" w:w="120"/>
-            </w:tcMar>
-          </w:tcPr>
-          <w:p>
-            <w:r>
-              <w:rPr>
-                <w:rFonts w:ascii="Arial" w:cs="Arial" w:eastAsia="Arial" w:hAnsi="Arial"/>
-                <w:color w:val="333333"/>
-                <w:sz w:val="20"/>
-                <w:szCs w:val="20"/>
-              </w:rPr>
-              <w:t>Rs. 10,000</w:t>
-            </w:r>
-          </w:p>
-        </w:tc>
-      </w:tr>
-      <w:tr>
-        <w:tc>
-          <w:tcPr>
-            <w:tcW w:type="dxa" w:w="6000"/>
-            <w:tcBorders>
-              <w:top w:val="single" w:color="CCCCCC" w:sz="1"/>
-              <w:left w:val="single" w:color="CCCCCC" w:sz="1"/>
-              <w:bottom w:val="single" w:color="CCCCCC" w:sz="1"/>
-              <w:right w:val="single" w:color="CCCCCC" w:sz="1"/>
-            </w:tcBorders>
-            <w:shd w:fill="D5E8F0" w:val="clear"/>
-            <w:tcMar>
-              <w:top w:type="dxa" w:w="80"/>
-              <w:left w:type="dxa" w:w="120"/>
-              <w:bottom w:type="dxa" w:w="80"/>
-              <w:right w:type="dxa" w:w="120"/>
-            </w:tcMar>
-          </w:tcPr>
-          <w:p>
-            <w:r>
-              <w:rPr>
-                <w:rFonts w:ascii="Arial" w:cs="Arial" w:eastAsia="Arial" w:hAnsi="Arial"/>
-                <w:b/>
-                <w:bCs/>
-                <w:color w:val="1A3C5E"/>
-                <w:sz w:val="21"/>
-                <w:szCs w:val="21"/>
-              </w:rPr>
-              <w:t xml:space="preserve">QA Subtotal</w:t>
-            </w:r>
-          </w:p>
-        </w:tc>
-        <w:tc>
-          <w:tcPr>
-            <w:tcW w:type="dxa" w:w="3360"/>
-            <w:tcBorders>
-              <w:top w:val="single" w:color="CCCCCC" w:sz="1"/>
-              <w:left w:val="single" w:color="CCCCCC" w:sz="1"/>
-              <w:bottom w:val="single" w:color="CCCCCC" w:sz="1"/>
-              <w:right w:val="single" w:color="CCCCCC" w:sz="1"/>
-            </w:tcBorders>
-            <w:shd w:fill="D5E8F0" w:val="clear"/>
-            <w:tcMar>
-              <w:top w:type="dxa" w:w="80"/>
-              <w:left w:type="dxa" w:w="120"/>
-              <w:bottom w:type="dxa" w:w="80"/>
-              <w:right w:type="dxa" w:w="120"/>
-            </w:tcMar>
-          </w:tcPr>
-          <w:p>
-            <w:r>
-              <w:rPr>
-                <w:rFonts w:ascii="Arial" w:cs="Arial" w:eastAsia="Arial" w:hAnsi="Arial"/>
-                <w:b/>
-                <w:bCs/>
-                <w:color w:val="1A3C5E"/>
-                <w:sz w:val="21"/>
-                <w:szCs w:val="21"/>
-              </w:rPr>
-              <w:t>Rs. 80,000</w:t>
-            </w:r>
-          </w:p>
-        </w:tc>
-      </w:tr>
-    </w:tbl>
-    <w:p>
-      <w:pPr>
-        <w:spacing w:after="0" w:before="100"/>
-      </w:pPr>
-      <w:r>
-        <w:t xml:space="preserve"/>
-      </w:r>
-    </w:p>
-    <w:p>
-      <w:pPr>
-        <w:pStyle w:val="Heading2"/>
-        <w:spacing w:after="100" w:before="260"/>
-      </w:pPr>
-      <w:r>
-        <w:rPr>
-          <w:rFonts w:ascii="Arial" w:cs="Arial" w:eastAsia="Arial" w:hAnsi="Arial"/>
-          <w:b/>
-          <w:bCs/>
-          <w:color w:val="2E86AB"/>
-          <w:sz w:val="26"/>
-          <w:szCs w:val="26"/>
-        </w:rPr>
-        <w:t xml:space="preserve">6.5  Post-Launch Support — 1 Month</w:t>
+        <w:t>6.4  Post-Launch Support — 1 Month</w:t>
       </w:r>
     </w:p>
     <w:tbl>
@@ -13785,7 +12844,7 @@
           <w:sz w:val="26"/>
           <w:szCs w:val="26"/>
         </w:rPr>
-        <w:t xml:space="preserve">6.6  Full Phase 1 Investment Summary</w:t>
+        <w:t>6.5  Full Phase 1 Investment Summary</w:t>
       </w:r>
     </w:p>
     <w:tbl>
@@ -14001,23 +13060,23 @@
               <w:bottom w:val="single" w:color="CCCCCC" w:sz="1"/>
               <w:right w:val="single" w:color="CCCCCC" w:sz="1"/>
             </w:tcBorders>
-            <w:shd w:fill="FFFFFF" w:val="clear"/>
-            <w:tcMar>
-              <w:top w:type="dxa" w:w="80"/>
-              <w:left w:type="dxa" w:w="120"/>
-              <w:bottom w:type="dxa" w:w="80"/>
-              <w:right w:type="dxa" w:w="120"/>
-            </w:tcMar>
-          </w:tcPr>
-          <w:p>
-            <w:r>
-              <w:rPr>
-                <w:rFonts w:ascii="Arial" w:cs="Arial" w:eastAsia="Arial" w:hAnsi="Arial"/>
-                <w:color w:val="333333"/>
-                <w:sz w:val="20"/>
-                <w:szCs w:val="20"/>
-              </w:rPr>
-              <w:t xml:space="preserve">Third-Party Integration Setup</w:t>
+            <w:shd w:fill="F0F6FA" w:val="clear"/>
+            <w:tcMar>
+              <w:top w:type="dxa" w:w="80"/>
+              <w:left w:type="dxa" w:w="120"/>
+              <w:bottom w:type="dxa" w:w="80"/>
+              <w:right w:type="dxa" w:w="120"/>
+            </w:tcMar>
+          </w:tcPr>
+          <w:p>
+            <w:r>
+              <w:rPr>
+                <w:rFonts w:ascii="Arial" w:cs="Arial" w:eastAsia="Arial" w:hAnsi="Arial"/>
+                <w:color w:val="333333"/>
+                <w:sz w:val="20"/>
+                <w:szCs w:val="20"/>
+              </w:rPr>
+              <w:t xml:space="preserve">Quality Assurance &amp; Testing</w:t>
             </w:r>
           </w:p>
         </w:tc>
@@ -14030,23 +13089,23 @@
               <w:bottom w:val="single" w:color="CCCCCC" w:sz="1"/>
               <w:right w:val="single" w:color="CCCCCC" w:sz="1"/>
             </w:tcBorders>
-            <w:shd w:fill="FFFFFF" w:val="clear"/>
-            <w:tcMar>
-              <w:top w:type="dxa" w:w="80"/>
-              <w:left w:type="dxa" w:w="120"/>
-              <w:bottom w:type="dxa" w:w="80"/>
-              <w:right w:type="dxa" w:w="120"/>
-            </w:tcMar>
-          </w:tcPr>
-          <w:p>
-            <w:r>
-              <w:rPr>
-                <w:rFonts w:ascii="Arial" w:cs="Arial" w:eastAsia="Arial" w:hAnsi="Arial"/>
-                <w:color w:val="333333"/>
-                <w:sz w:val="20"/>
-                <w:szCs w:val="20"/>
-              </w:rPr>
-              <w:t>Rs. 50,000</w:t>
+            <w:shd w:fill="F0F6FA" w:val="clear"/>
+            <w:tcMar>
+              <w:top w:type="dxa" w:w="80"/>
+              <w:left w:type="dxa" w:w="120"/>
+              <w:bottom w:type="dxa" w:w="80"/>
+              <w:right w:type="dxa" w:w="120"/>
+            </w:tcMar>
+          </w:tcPr>
+          <w:p>
+            <w:r>
+              <w:rPr>
+                <w:rFonts w:ascii="Arial" w:cs="Arial" w:eastAsia="Arial" w:hAnsi="Arial"/>
+                <w:color w:val="333333"/>
+                <w:sz w:val="20"/>
+                <w:szCs w:val="20"/>
+              </w:rPr>
+              <w:t>Rs. 80,000</w:t>
             </w:r>
           </w:p>
         </w:tc>
@@ -14061,6 +13120,66 @@
               <w:bottom w:val="single" w:color="CCCCCC" w:sz="1"/>
               <w:right w:val="single" w:color="CCCCCC" w:sz="1"/>
             </w:tcBorders>
+            <w:shd w:fill="FFFFFF" w:val="clear"/>
+            <w:tcMar>
+              <w:top w:type="dxa" w:w="80"/>
+              <w:left w:type="dxa" w:w="120"/>
+              <w:bottom w:type="dxa" w:w="80"/>
+              <w:right w:type="dxa" w:w="120"/>
+            </w:tcMar>
+          </w:tcPr>
+          <w:p>
+            <w:r>
+              <w:rPr>
+                <w:rFonts w:ascii="Arial" w:cs="Arial" w:eastAsia="Arial" w:hAnsi="Arial"/>
+                <w:color w:val="333333"/>
+                <w:sz w:val="20"/>
+                <w:szCs w:val="20"/>
+              </w:rPr>
+              <w:t xml:space="preserve">Post-Launch Support (1 month)</w:t>
+            </w:r>
+          </w:p>
+        </w:tc>
+        <w:tc>
+          <w:tcPr>
+            <w:tcW w:type="dxa" w:w="3120"/>
+            <w:tcBorders>
+              <w:top w:val="single" w:color="CCCCCC" w:sz="1"/>
+              <w:left w:val="single" w:color="CCCCCC" w:sz="1"/>
+              <w:bottom w:val="single" w:color="CCCCCC" w:sz="1"/>
+              <w:right w:val="single" w:color="CCCCCC" w:sz="1"/>
+            </w:tcBorders>
+            <w:shd w:fill="FFFFFF" w:val="clear"/>
+            <w:tcMar>
+              <w:top w:type="dxa" w:w="80"/>
+              <w:left w:type="dxa" w:w="120"/>
+              <w:bottom w:type="dxa" w:w="80"/>
+              <w:right w:type="dxa" w:w="120"/>
+            </w:tcMar>
+          </w:tcPr>
+          <w:p>
+            <w:r>
+              <w:rPr>
+                <w:rFonts w:ascii="Arial" w:cs="Arial" w:eastAsia="Arial" w:hAnsi="Arial"/>
+                <w:color w:val="333333"/>
+                <w:sz w:val="20"/>
+                <w:szCs w:val="20"/>
+              </w:rPr>
+              <w:t>Rs. 40,000</w:t>
+            </w:r>
+          </w:p>
+        </w:tc>
+      </w:tr>
+      <w:tr>
+        <w:tc>
+          <w:tcPr>
+            <w:tcW w:type="dxa" w:w="6240"/>
+            <w:tcBorders>
+              <w:top w:val="single" w:color="CCCCCC" w:sz="1"/>
+              <w:left w:val="single" w:color="CCCCCC" w:sz="1"/>
+              <w:bottom w:val="single" w:color="CCCCCC" w:sz="1"/>
+              <w:right w:val="single" w:color="CCCCCC" w:sz="1"/>
+            </w:tcBorders>
             <w:shd w:fill="F0F6FA" w:val="clear"/>
             <w:tcMar>
               <w:top w:type="dxa" w:w="80"/>
@@ -14077,7 +13196,7 @@
                 <w:sz w:val="20"/>
                 <w:szCs w:val="20"/>
               </w:rPr>
-              <w:t xml:space="preserve">Quality Assurance &amp; Testing</w:t>
+              <w:t xml:space="preserve">Subtotal</w:t>
             </w:r>
           </w:p>
         </w:tc>
@@ -14106,187 +13225,67 @@
                 <w:sz w:val="20"/>
                 <w:szCs w:val="20"/>
               </w:rPr>
+              <w:t>Rs. 10,20,000</w:t>
+            </w:r>
+          </w:p>
+        </w:tc>
+      </w:tr>
+      <w:tr>
+        <w:tc>
+          <w:tcPr>
+            <w:tcW w:type="dxa" w:w="6240"/>
+            <w:tcBorders>
+              <w:top w:val="single" w:color="CCCCCC" w:sz="1"/>
+              <w:left w:val="single" w:color="CCCCCC" w:sz="1"/>
+              <w:bottom w:val="single" w:color="CCCCCC" w:sz="1"/>
+              <w:right w:val="single" w:color="CCCCCC" w:sz="1"/>
+            </w:tcBorders>
+            <w:shd w:fill="FFFFFF" w:val="clear"/>
+            <w:tcMar>
+              <w:top w:type="dxa" w:w="80"/>
+              <w:left w:type="dxa" w:w="120"/>
+              <w:bottom w:type="dxa" w:w="80"/>
+              <w:right w:type="dxa" w:w="120"/>
+            </w:tcMar>
+          </w:tcPr>
+          <w:p>
+            <w:r>
+              <w:rPr>
+                <w:rFonts w:ascii="Arial" w:cs="Arial" w:eastAsia="Arial" w:hAnsi="Arial"/>
+                <w:color w:val="333333"/>
+                <w:sz w:val="20"/>
+                <w:szCs w:val="20"/>
+              </w:rPr>
+              <w:t xml:space="preserve">Contingency Reserve (5.7%)</w:t>
+            </w:r>
+          </w:p>
+        </w:tc>
+        <w:tc>
+          <w:tcPr>
+            <w:tcW w:type="dxa" w:w="3120"/>
+            <w:tcBorders>
+              <w:top w:val="single" w:color="CCCCCC" w:sz="1"/>
+              <w:left w:val="single" w:color="CCCCCC" w:sz="1"/>
+              <w:bottom w:val="single" w:color="CCCCCC" w:sz="1"/>
+              <w:right w:val="single" w:color="CCCCCC" w:sz="1"/>
+            </w:tcBorders>
+            <w:shd w:fill="FFFFFF" w:val="clear"/>
+            <w:tcMar>
+              <w:top w:type="dxa" w:w="80"/>
+              <w:left w:type="dxa" w:w="120"/>
+              <w:bottom w:type="dxa" w:w="80"/>
+              <w:right w:type="dxa" w:w="120"/>
+            </w:tcMar>
+          </w:tcPr>
+          <w:p>
+            <w:r>
+              <w:rPr>
+                <w:rFonts w:ascii="Arial" w:cs="Arial" w:eastAsia="Arial" w:hAnsi="Arial"/>
+                <w:color w:val="333333"/>
+                <w:sz w:val="20"/>
+                <w:szCs w:val="20"/>
+              </w:rPr>
               <w:t>Rs. 80,000</w:t>
-            </w:r>
-          </w:p>
-        </w:tc>
-      </w:tr>
-      <w:tr>
-        <w:tc>
-          <w:tcPr>
-            <w:tcW w:type="dxa" w:w="6240"/>
-            <w:tcBorders>
-              <w:top w:val="single" w:color="CCCCCC" w:sz="1"/>
-              <w:left w:val="single" w:color="CCCCCC" w:sz="1"/>
-              <w:bottom w:val="single" w:color="CCCCCC" w:sz="1"/>
-              <w:right w:val="single" w:color="CCCCCC" w:sz="1"/>
-            </w:tcBorders>
-            <w:shd w:fill="FFFFFF" w:val="clear"/>
-            <w:tcMar>
-              <w:top w:type="dxa" w:w="80"/>
-              <w:left w:type="dxa" w:w="120"/>
-              <w:bottom w:type="dxa" w:w="80"/>
-              <w:right w:type="dxa" w:w="120"/>
-            </w:tcMar>
-          </w:tcPr>
-          <w:p>
-            <w:r>
-              <w:rPr>
-                <w:rFonts w:ascii="Arial" w:cs="Arial" w:eastAsia="Arial" w:hAnsi="Arial"/>
-                <w:color w:val="333333"/>
-                <w:sz w:val="20"/>
-                <w:szCs w:val="20"/>
-              </w:rPr>
-              <w:t xml:space="preserve">Post-Launch Support (1 month)</w:t>
-            </w:r>
-          </w:p>
-        </w:tc>
-        <w:tc>
-          <w:tcPr>
-            <w:tcW w:type="dxa" w:w="3120"/>
-            <w:tcBorders>
-              <w:top w:val="single" w:color="CCCCCC" w:sz="1"/>
-              <w:left w:val="single" w:color="CCCCCC" w:sz="1"/>
-              <w:bottom w:val="single" w:color="CCCCCC" w:sz="1"/>
-              <w:right w:val="single" w:color="CCCCCC" w:sz="1"/>
-            </w:tcBorders>
-            <w:shd w:fill="FFFFFF" w:val="clear"/>
-            <w:tcMar>
-              <w:top w:type="dxa" w:w="80"/>
-              <w:left w:type="dxa" w:w="120"/>
-              <w:bottom w:type="dxa" w:w="80"/>
-              <w:right w:type="dxa" w:w="120"/>
-            </w:tcMar>
-          </w:tcPr>
-          <w:p>
-            <w:r>
-              <w:rPr>
-                <w:rFonts w:ascii="Arial" w:cs="Arial" w:eastAsia="Arial" w:hAnsi="Arial"/>
-                <w:color w:val="333333"/>
-                <w:sz w:val="20"/>
-                <w:szCs w:val="20"/>
-              </w:rPr>
-              <w:t>Rs. 40,000</w:t>
-            </w:r>
-          </w:p>
-        </w:tc>
-      </w:tr>
-      <w:tr>
-        <w:tc>
-          <w:tcPr>
-            <w:tcW w:type="dxa" w:w="6240"/>
-            <w:tcBorders>
-              <w:top w:val="single" w:color="CCCCCC" w:sz="1"/>
-              <w:left w:val="single" w:color="CCCCCC" w:sz="1"/>
-              <w:bottom w:val="single" w:color="CCCCCC" w:sz="1"/>
-              <w:right w:val="single" w:color="CCCCCC" w:sz="1"/>
-            </w:tcBorders>
-            <w:shd w:fill="F0F6FA" w:val="clear"/>
-            <w:tcMar>
-              <w:top w:type="dxa" w:w="80"/>
-              <w:left w:type="dxa" w:w="120"/>
-              <w:bottom w:type="dxa" w:w="80"/>
-              <w:right w:type="dxa" w:w="120"/>
-            </w:tcMar>
-          </w:tcPr>
-          <w:p>
-            <w:r>
-              <w:rPr>
-                <w:rFonts w:ascii="Arial" w:cs="Arial" w:eastAsia="Arial" w:hAnsi="Arial"/>
-                <w:color w:val="333333"/>
-                <w:sz w:val="20"/>
-                <w:szCs w:val="20"/>
-              </w:rPr>
-              <w:t xml:space="preserve">Subtotal</w:t>
-            </w:r>
-          </w:p>
-        </w:tc>
-        <w:tc>
-          <w:tcPr>
-            <w:tcW w:type="dxa" w:w="3120"/>
-            <w:tcBorders>
-              <w:top w:val="single" w:color="CCCCCC" w:sz="1"/>
-              <w:left w:val="single" w:color="CCCCCC" w:sz="1"/>
-              <w:bottom w:val="single" w:color="CCCCCC" w:sz="1"/>
-              <w:right w:val="single" w:color="CCCCCC" w:sz="1"/>
-            </w:tcBorders>
-            <w:shd w:fill="F0F6FA" w:val="clear"/>
-            <w:tcMar>
-              <w:top w:type="dxa" w:w="80"/>
-              <w:left w:type="dxa" w:w="120"/>
-              <w:bottom w:type="dxa" w:w="80"/>
-              <w:right w:type="dxa" w:w="120"/>
-            </w:tcMar>
-          </w:tcPr>
-          <w:p>
-            <w:r>
-              <w:rPr>
-                <w:rFonts w:ascii="Arial" w:cs="Arial" w:eastAsia="Arial" w:hAnsi="Arial"/>
-                <w:color w:val="333333"/>
-                <w:sz w:val="20"/>
-                <w:szCs w:val="20"/>
-              </w:rPr>
-              <w:t>Rs. 10,70,000</w:t>
-            </w:r>
-          </w:p>
-        </w:tc>
-      </w:tr>
-      <w:tr>
-        <w:tc>
-          <w:tcPr>
-            <w:tcW w:type="dxa" w:w="6240"/>
-            <w:tcBorders>
-              <w:top w:val="single" w:color="CCCCCC" w:sz="1"/>
-              <w:left w:val="single" w:color="CCCCCC" w:sz="1"/>
-              <w:bottom w:val="single" w:color="CCCCCC" w:sz="1"/>
-              <w:right w:val="single" w:color="CCCCCC" w:sz="1"/>
-            </w:tcBorders>
-            <w:shd w:fill="FFFFFF" w:val="clear"/>
-            <w:tcMar>
-              <w:top w:type="dxa" w:w="80"/>
-              <w:left w:type="dxa" w:w="120"/>
-              <w:bottom w:type="dxa" w:w="80"/>
-              <w:right w:type="dxa" w:w="120"/>
-            </w:tcMar>
-          </w:tcPr>
-          <w:p>
-            <w:r>
-              <w:rPr>
-                <w:rFonts w:ascii="Arial" w:cs="Arial" w:eastAsia="Arial" w:hAnsi="Arial"/>
-                <w:color w:val="333333"/>
-                <w:sz w:val="20"/>
-                <w:szCs w:val="20"/>
-              </w:rPr>
-              <w:t xml:space="preserve">Contingency Reserve (5.7%)</w:t>
-            </w:r>
-          </w:p>
-        </w:tc>
-        <w:tc>
-          <w:tcPr>
-            <w:tcW w:type="dxa" w:w="3120"/>
-            <w:tcBorders>
-              <w:top w:val="single" w:color="CCCCCC" w:sz="1"/>
-              <w:left w:val="single" w:color="CCCCCC" w:sz="1"/>
-              <w:bottom w:val="single" w:color="CCCCCC" w:sz="1"/>
-              <w:right w:val="single" w:color="CCCCCC" w:sz="1"/>
-            </w:tcBorders>
-            <w:shd w:fill="FFFFFF" w:val="clear"/>
-            <w:tcMar>
-              <w:top w:type="dxa" w:w="80"/>
-              <w:left w:type="dxa" w:w="120"/>
-              <w:bottom w:type="dxa" w:w="80"/>
-              <w:right w:type="dxa" w:w="120"/>
-            </w:tcMar>
-          </w:tcPr>
-          <w:p>
-            <w:r>
-              <w:rPr>
-                <w:rFonts w:ascii="Arial" w:cs="Arial" w:eastAsia="Arial" w:hAnsi="Arial"/>
-                <w:color w:val="333333"/>
-                <w:sz w:val="20"/>
-                <w:szCs w:val="20"/>
-              </w:rPr>
-              <w:t>Rs. 30,000</w:t>
             </w:r>
           </w:p>
         </w:tc>
@@ -19460,7 +18459,7 @@
                 <w:sz w:val="20"/>
                 <w:szCs w:val="20"/>
               </w:rPr>
-              <w:t xml:space="preserve">Ongoing API usage costs (Maps, Firebase, SMS, email)</w:t>
+              <w:t>Third-party API usage costs (Maps, Firebase, SMS, email, S3, Sentry)</w:t>
             </w:r>
           </w:p>
         </w:tc>
@@ -19489,7 +18488,7 @@
                 <w:sz w:val="20"/>
                 <w:szCs w:val="20"/>
               </w:rPr>
-              <w:t xml:space="preserve">Billed directly to client by each provider</w:t>
+              <w:t>Usage-based — billed directly to client by each provider based on actual platform usage</w:t>
             </w:r>
           </w:p>
         </w:tc>

</xml_diff>